<commit_message>
style(checklist): renforcement du repérage
</commit_message>
<xml_diff>
--- a/livrables-IGPDE-2026-102846/Livrables-Stagiaires/tp-word-igpde/checklist-accessibilite-bureautique.docx
+++ b/livrables-IGPDE-2026-102846/Livrables-Stagiaires/tp-word-igpde/checklist-accessibilite-bureautique.docx
@@ -135,6 +135,9 @@
           </w:tcPr>
           <w:p>
             <w:r>
+              <w:rPr>
+                <w:b/>
+              </w:rPr>
               <w:t>P-01 · P</w:t>
             </w:r>
           </w:p>
@@ -145,6 +148,9 @@
           </w:tcPr>
           <w:p>
             <w:r>
+              <w:rPr>
+                <w:b/>
+              </w:rPr>
               <w:t>Le titre principal et les titres de section utilisent des styles adaptés.</w:t>
             </w:r>
           </w:p>
@@ -176,6 +182,9 @@
           </w:tcPr>
           <w:p>
             <w:r>
+              <w:rPr>
+                <w:b/>
+              </w:rPr>
               <w:t>P-02 · P</w:t>
             </w:r>
           </w:p>
@@ -186,6 +195,9 @@
           </w:tcPr>
           <w:p>
             <w:r>
+              <w:rPr>
+                <w:b/>
+              </w:rPr>
               <w:t>La hiérarchie des titres ne saute aucun niveau.</w:t>
             </w:r>
           </w:p>
@@ -217,6 +229,9 @@
           </w:tcPr>
           <w:p>
             <w:r>
+              <w:rPr>
+                <w:b/>
+              </w:rPr>
               <w:t>P-03 · P</w:t>
             </w:r>
           </w:p>
@@ -227,6 +242,9 @@
           </w:tcPr>
           <w:p>
             <w:r>
+              <w:rPr>
+                <w:b/>
+              </w:rPr>
               <w:t>Le volet de navigation et le sommaire automatique reflètent le même plan.</w:t>
             </w:r>
           </w:p>
@@ -258,6 +276,9 @@
           </w:tcPr>
           <w:p>
             <w:r>
+              <w:rPr>
+                <w:b/>
+              </w:rPr>
               <w:t>P-04 · P</w:t>
             </w:r>
           </w:p>
@@ -268,6 +289,9 @@
           </w:tcPr>
           <w:p>
             <w:r>
+              <w:rPr>
+                <w:b/>
+              </w:rPr>
               <w:t>Les listes sont créées avec les fonctions de puces ou de numérotation.</w:t>
             </w:r>
           </w:p>
@@ -299,6 +323,9 @@
           </w:tcPr>
           <w:p>
             <w:r>
+              <w:rPr>
+                <w:b/>
+              </w:rPr>
               <w:t>P-05 · P</w:t>
             </w:r>
           </w:p>
@@ -309,6 +336,9 @@
           </w:tcPr>
           <w:p>
             <w:r>
+              <w:rPr>
+                <w:b/>
+              </w:rPr>
               <w:t>La mise en page n'est pas simulée par des caractères ou des paragraphes vides.</w:t>
             </w:r>
           </w:p>
@@ -409,6 +439,9 @@
           </w:tcPr>
           <w:p>
             <w:r>
+              <w:rPr>
+                <w:b/>
+              </w:rPr>
               <w:t>P-06 · P</w:t>
             </w:r>
           </w:p>
@@ -419,6 +452,9 @@
           </w:tcPr>
           <w:p>
             <w:r>
+              <w:rPr>
+                <w:b/>
+              </w:rPr>
               <w:t>Chaque image informative simple possède une alternative pertinente.</w:t>
             </w:r>
           </w:p>
@@ -450,6 +486,9 @@
           </w:tcPr>
           <w:p>
             <w:r>
+              <w:rPr>
+                <w:b/>
+              </w:rPr>
               <w:t>P-07 · P</w:t>
             </w:r>
           </w:p>
@@ -460,6 +499,9 @@
           </w:tcPr>
           <w:p>
             <w:r>
+              <w:rPr>
+                <w:b/>
+              </w:rPr>
               <w:t>Une image complexe possède une alternative courte et une description détaillée adjacente.</w:t>
             </w:r>
           </w:p>
@@ -491,6 +533,9 @@
           </w:tcPr>
           <w:p>
             <w:r>
+              <w:rPr>
+                <w:b/>
+              </w:rPr>
               <w:t>P-08 · P</w:t>
             </w:r>
           </w:p>
@@ -501,6 +546,9 @@
           </w:tcPr>
           <w:p>
             <w:r>
+              <w:rPr>
+                <w:b/>
+              </w:rPr>
               <w:t>Les images redondantes sont traitées comme décoratives sans masquer d'information.</w:t>
             </w:r>
           </w:p>
@@ -532,6 +580,9 @@
           </w:tcPr>
           <w:p>
             <w:r>
+              <w:rPr>
+                <w:b/>
+              </w:rPr>
               <w:t>P-09 · P</w:t>
             </w:r>
           </w:p>
@@ -542,6 +593,9 @@
           </w:tcPr>
           <w:p>
             <w:r>
+              <w:rPr>
+                <w:b/>
+              </w:rPr>
               <w:t>Les informations textuelles sont fournies en vrai texte, pas seulement en image.</w:t>
             </w:r>
           </w:p>
@@ -573,6 +627,9 @@
           </w:tcPr>
           <w:p>
             <w:r>
+              <w:rPr>
+                <w:b/>
+              </w:rPr>
               <w:t>P-10 · P</w:t>
             </w:r>
           </w:p>
@@ -583,6 +640,9 @@
           </w:tcPr>
           <w:p>
             <w:r>
+              <w:rPr>
+                <w:b/>
+              </w:rPr>
               <w:t>Chaque lien est compréhensible hors contexte et chaque téléchargement est décrit.</w:t>
             </w:r>
           </w:p>
@@ -614,6 +674,9 @@
           </w:tcPr>
           <w:p>
             <w:r>
+              <w:rPr>
+                <w:b/>
+              </w:rPr>
               <w:t>P-11 · P</w:t>
             </w:r>
           </w:p>
@@ -624,6 +687,9 @@
           </w:tcPr>
           <w:p>
             <w:r>
+              <w:rPr>
+                <w:b/>
+              </w:rPr>
               <w:t>Toute information essentielle portée par un en-tête, un filigrane ou un arrière-plan est aussi présente dans le corps.</w:t>
             </w:r>
           </w:p>
@@ -724,6 +790,9 @@
           </w:tcPr>
           <w:p>
             <w:r>
+              <w:rPr>
+                <w:b/>
+              </w:rPr>
               <w:t>P-12 · P</w:t>
             </w:r>
           </w:p>
@@ -734,6 +803,9 @@
           </w:tcPr>
           <w:p>
             <w:r>
+              <w:rPr>
+                <w:b/>
+              </w:rPr>
               <w:t>Les contrastes sont mesurés et atteignent le seuil correspondant au contenu.</w:t>
             </w:r>
           </w:p>
@@ -765,6 +837,9 @@
           </w:tcPr>
           <w:p>
             <w:r>
+              <w:rPr>
+                <w:b/>
+              </w:rPr>
               <w:t>P-13 · P</w:t>
             </w:r>
           </w:p>
@@ -775,6 +850,9 @@
           </w:tcPr>
           <w:p>
             <w:r>
+              <w:rPr>
+                <w:b/>
+              </w:rPr>
               <w:t>Une information donnée par la couleur possède aussi un repère non coloré.</w:t>
             </w:r>
           </w:p>
@@ -806,6 +884,9 @@
           </w:tcPr>
           <w:p>
             <w:r>
+              <w:rPr>
+                <w:b/>
+              </w:rPr>
               <w:t>P-14 · P</w:t>
             </w:r>
           </w:p>
@@ -816,6 +897,9 @@
           </w:tcPr>
           <w:p>
             <w:r>
+              <w:rPr>
+                <w:b/>
+              </w:rPr>
               <w:t>Les tableaux de données sont simples, titrés et possèdent des en-têtes identifiés.</w:t>
             </w:r>
           </w:p>
@@ -916,6 +1000,9 @@
           </w:tcPr>
           <w:p>
             <w:r>
+              <w:rPr>
+                <w:b/>
+              </w:rPr>
               <w:t>P-15 · P</w:t>
             </w:r>
           </w:p>
@@ -926,6 +1013,9 @@
           </w:tcPr>
           <w:p>
             <w:r>
+              <w:rPr>
+                <w:b/>
+              </w:rPr>
               <w:t>La langue principale et les changements de langue sont correctement définis.</w:t>
             </w:r>
           </w:p>
@@ -957,6 +1047,9 @@
           </w:tcPr>
           <w:p>
             <w:r>
+              <w:rPr>
+                <w:b/>
+              </w:rPr>
               <w:t>P-16 · P</w:t>
             </w:r>
           </w:p>
@@ -967,6 +1060,9 @@
           </w:tcPr>
           <w:p>
             <w:r>
+              <w:rPr>
+                <w:b/>
+              </w:rPr>
               <w:t>Le corps utilise une police sans sérif, au moins 12 points, un interligne de 1,15 et un alignement à gauche.</w:t>
             </w:r>
           </w:p>
@@ -998,6 +1094,9 @@
           </w:tcPr>
           <w:p>
             <w:r>
+              <w:rPr>
+                <w:b/>
+              </w:rPr>
               <w:t>P-17 · P</w:t>
             </w:r>
           </w:p>
@@ -1008,6 +1107,9 @@
           </w:tcPr>
           <w:p>
             <w:r>
+              <w:rPr>
+                <w:b/>
+              </w:rPr>
               <w:t>Les mots sont saisis normalement avec leurs accents avant toute mise en forme en majuscules.</w:t>
             </w:r>
           </w:p>
@@ -1039,6 +1141,9 @@
           </w:tcPr>
           <w:p>
             <w:r>
+              <w:rPr>
+                <w:b/>
+              </w:rPr>
               <w:t>P-18 · P</w:t>
             </w:r>
           </w:p>
@@ -1049,6 +1154,9 @@
           </w:tcPr>
           <w:p>
             <w:r>
+              <w:rPr>
+                <w:b/>
+              </w:rPr>
               <w:t>Les sigles sont développés à leur première occurrence et les majuscules sont vérifiées.</w:t>
             </w:r>
           </w:p>
@@ -1149,6 +1257,9 @@
           </w:tcPr>
           <w:p>
             <w:r>
+              <w:rPr>
+                <w:b/>
+              </w:rPr>
               <w:t>P-19 · P</w:t>
             </w:r>
           </w:p>
@@ -1159,6 +1270,9 @@
           </w:tcPr>
           <w:p>
             <w:r>
+              <w:rPr>
+                <w:b/>
+              </w:rPr>
               <w:t>Le titre, l'auteur, la langue et le nom de fichier sont renseignés de façon descriptive.</w:t>
             </w:r>
           </w:p>
@@ -1190,6 +1304,9 @@
           </w:tcPr>
           <w:p>
             <w:r>
+              <w:rPr>
+                <w:b/>
+              </w:rPr>
               <w:t>P-20 · P</w:t>
             </w:r>
           </w:p>
@@ -1200,6 +1317,9 @@
           </w:tcPr>
           <w:p>
             <w:r>
+              <w:rPr>
+                <w:b/>
+              </w:rPr>
               <w:t>Le PDF est exporté avec ses propriétés, ses balises et ses signets.</w:t>
             </w:r>
           </w:p>
@@ -1231,6 +1351,9 @@
           </w:tcPr>
           <w:p>
             <w:r>
+              <w:rPr>
+                <w:b/>
+              </w:rPr>
               <w:t>C-01 · C</w:t>
             </w:r>
           </w:p>
@@ -1241,6 +1364,9 @@
           </w:tcPr>
           <w:p>
             <w:r>
+              <w:rPr>
+                <w:b/>
+              </w:rPr>
               <w:t>Le vérificateur a été exécuté, ses alertes pertinentes traitées et les alertes résiduelles expliquées.</w:t>
             </w:r>
           </w:p>
@@ -1272,6 +1398,9 @@
           </w:tcPr>
           <w:p>
             <w:r>
+              <w:rPr>
+                <w:b/>
+              </w:rPr>
               <w:t>C-02 · C</w:t>
             </w:r>
           </w:p>
@@ -1282,6 +1411,9 @@
           </w:tcPr>
           <w:p>
             <w:r>
+              <w:rPr>
+                <w:b/>
+              </w:rPr>
               <w:t>Le PDF a été contrôlé après export avec PAC ou Acrobat Pro puis avec la checklist humaine.</w:t>
             </w:r>
           </w:p>
@@ -1387,6 +1519,9 @@
           </w:tcPr>
           <w:p>
             <w:r>
+              <w:rPr>
+                <w:b/>
+              </w:rPr>
               <w:t>S-01 · S</w:t>
             </w:r>
           </w:p>
@@ -1397,6 +1532,9 @@
           </w:tcPr>
           <w:p>
             <w:r>
+              <w:rPr>
+                <w:b/>
+              </w:rPr>
               <w:t>Le document n'est pas protégé lorsque sa modification doit rester possible.</w:t>
             </w:r>
           </w:p>
@@ -1428,6 +1566,9 @@
           </w:tcPr>
           <w:p>
             <w:r>
+              <w:rPr>
+                <w:b/>
+              </w:rPr>
               <w:t>S-02 · S</w:t>
             </w:r>
           </w:p>
@@ -1438,6 +1579,9 @@
           </w:tcPr>
           <w:p>
             <w:r>
+              <w:rPr>
+                <w:b/>
+              </w:rPr>
               <w:t>Le document ne contient aucun contenu clignotant.</w:t>
             </w:r>
           </w:p>
@@ -1469,6 +1613,9 @@
           </w:tcPr>
           <w:p>
             <w:r>
+              <w:rPr>
+                <w:b/>
+              </w:rPr>
               <w:t>S-03 · S</w:t>
             </w:r>
           </w:p>
@@ -1479,6 +1626,9 @@
           </w:tcPr>
           <w:p>
             <w:r>
+              <w:rPr>
+                <w:b/>
+              </w:rPr>
               <w:t>Le document ne contient pas de formulaire Word interactif.</w:t>
             </w:r>
           </w:p>
@@ -1510,6 +1660,9 @@
           </w:tcPr>
           <w:p>
             <w:r>
+              <w:rPr>
+                <w:b/>
+              </w:rPr>
               <w:t>S-04 · S</w:t>
             </w:r>
           </w:p>
@@ -1520,6 +1673,9 @@
           </w:tcPr>
           <w:p>
             <w:r>
+              <w:rPr>
+                <w:b/>
+              </w:rPr>
               <w:t>Les objets et zones de texte flottants ne portent aucune information essentielle.</w:t>
             </w:r>
           </w:p>
@@ -1551,6 +1707,9 @@
           </w:tcPr>
           <w:p>
             <w:r>
+              <w:rPr>
+                <w:b/>
+              </w:rPr>
               <w:t>S-05 · S</w:t>
             </w:r>
           </w:p>
@@ -1561,6 +1720,9 @@
           </w:tcPr>
           <w:p>
             <w:r>
+              <w:rPr>
+                <w:b/>
+              </w:rPr>
               <w:t>Les tableaux ne servent pas à la mise en page et ne sont pas flottants.</w:t>
             </w:r>
           </w:p>

</xml_diff>